<commit_message>
docs: documentar correccion de arranque mysql
</commit_message>
<xml_diff>
--- a/output/doc/entrega_modulo_login_sesion.docx
+++ b/output/doc/entrega_modulo_login_sesion.docx
@@ -1978,6 +1978,290 @@
       </w:tr>
     </w:tbl>
     <w:p/>
+    <w:p>
+      <w:r>
+        <w:br w:type="page"/>
+      </w:r>
+    </w:p>
+    <w:p>
+      <w:pPr>
+        <w:pStyle w:val="Heading1"/>
+      </w:pPr>
+      <w:r>
+        <w:rPr>
+          <w:color w:val="0F172A"/>
+        </w:rPr>
+        <w:t>8. Correccion de arranque Docker/MySQL</w:t>
+      </w:r>
+    </w:p>
+    <w:p>
+      <w:r>
+        <w:t>Durante la verificacion final se detecto que una copia local podia intentar usar SQLite por conservar DB_CONNECTION=sqlite en .env. Esto provocaba el error de archivo inexistente database/database.sqlite al cargar sesiones. Se corrigio el arranque Docker para sincronizar las variables MySQL del docker-compose hacia .env antes de limpiar configuracion, migrar y servir Laravel.</w:t>
+      </w:r>
+    </w:p>
+    <w:tbl>
+      <w:tblPr>
+        <w:tblStyle w:val="TableGrid"/>
+        <w:tblW w:type="auto" w:w="0"/>
+        <w:tblLook w:firstColumn="1" w:firstRow="1" w:lastColumn="0" w:lastRow="0" w:noHBand="0" w:noVBand="1" w:val="04A0"/>
+      </w:tblPr>
+      <w:tblGrid>
+        <w:gridCol w:w="4968"/>
+        <w:gridCol w:w="4968"/>
+      </w:tblGrid>
+      <w:tr>
+        <w:tc>
+          <w:tcPr>
+            <w:tcW w:type="dxa" w:w="4968"/>
+            <w:shd w:fill="D9EAF7"/>
+            <w:vAlign w:val="center"/>
+          </w:tcPr>
+          <w:p>
+            <w:r/>
+            <w:r>
+              <w:rPr>
+                <w:b/>
+                <w:sz w:val="18"/>
+              </w:rPr>
+              <w:t>Elemento</w:t>
+            </w:r>
+          </w:p>
+        </w:tc>
+        <w:tc>
+          <w:tcPr>
+            <w:tcW w:type="dxa" w:w="4968"/>
+            <w:shd w:fill="D9EAF7"/>
+            <w:vAlign w:val="center"/>
+          </w:tcPr>
+          <w:p>
+            <w:r/>
+            <w:r>
+              <w:rPr>
+                <w:b/>
+                <w:sz w:val="18"/>
+              </w:rPr>
+              <w:t>Detalle</w:t>
+            </w:r>
+          </w:p>
+        </w:tc>
+      </w:tr>
+      <w:tr>
+        <w:tc>
+          <w:tcPr>
+            <w:tcW w:type="dxa" w:w="4968"/>
+            <w:vAlign w:val="center"/>
+          </w:tcPr>
+          <w:p>
+            <w:r/>
+            <w:r>
+              <w:rPr>
+                <w:b w:val="0"/>
+                <w:sz w:val="18"/>
+              </w:rPr>
+              <w:t>Error observado</w:t>
+            </w:r>
+          </w:p>
+        </w:tc>
+        <w:tc>
+          <w:tcPr>
+            <w:tcW w:type="dxa" w:w="4968"/>
+            <w:vAlign w:val="center"/>
+          </w:tcPr>
+          <w:p>
+            <w:r/>
+            <w:r>
+              <w:rPr>
+                <w:b w:val="0"/>
+                <w:sz w:val="18"/>
+              </w:rPr>
+              <w:t>Database file at path [/var/www/html/database/database.sqlite] does not exist.</w:t>
+            </w:r>
+          </w:p>
+        </w:tc>
+      </w:tr>
+      <w:tr>
+        <w:tc>
+          <w:tcPr>
+            <w:tcW w:type="dxa" w:w="4968"/>
+            <w:vAlign w:val="center"/>
+          </w:tcPr>
+          <w:p>
+            <w:r/>
+            <w:r>
+              <w:rPr>
+                <w:b w:val="0"/>
+                <w:sz w:val="18"/>
+              </w:rPr>
+              <w:t>Causa</w:t>
+            </w:r>
+          </w:p>
+        </w:tc>
+        <w:tc>
+          <w:tcPr>
+            <w:tcW w:type="dxa" w:w="4968"/>
+            <w:vAlign w:val="center"/>
+          </w:tcPr>
+          <w:p>
+            <w:r/>
+            <w:r>
+              <w:rPr>
+                <w:b w:val="0"/>
+                <w:sz w:val="18"/>
+              </w:rPr>
+              <w:t>El archivo .env local conservaba DB_CONNECTION=sqlite aunque el flujo de entrega usa MySQL en Docker.</w:t>
+            </w:r>
+          </w:p>
+        </w:tc>
+      </w:tr>
+      <w:tr>
+        <w:tc>
+          <w:tcPr>
+            <w:tcW w:type="dxa" w:w="4968"/>
+            <w:vAlign w:val="center"/>
+          </w:tcPr>
+          <w:p>
+            <w:r/>
+            <w:r>
+              <w:rPr>
+                <w:b w:val="0"/>
+                <w:sz w:val="18"/>
+              </w:rPr>
+              <w:t>Cambio aplicado</w:t>
+            </w:r>
+          </w:p>
+        </w:tc>
+        <w:tc>
+          <w:tcPr>
+            <w:tcW w:type="dxa" w:w="4968"/>
+            <w:vAlign w:val="center"/>
+          </w:tcPr>
+          <w:p>
+            <w:r/>
+            <w:r>
+              <w:rPr>
+                <w:b w:val="0"/>
+                <w:sz w:val="18"/>
+              </w:rPr>
+              <w:t>docker/app/start.sh ahora fuerza las variables DB_CONNECTION=mysql, DB_HOST=mysql, credenciales MySQL, crea database/database.sqlite como respaldo local y ejecuta config:clear antes de migrar.</w:t>
+            </w:r>
+          </w:p>
+        </w:tc>
+      </w:tr>
+      <w:tr>
+        <w:tc>
+          <w:tcPr>
+            <w:tcW w:type="dxa" w:w="4968"/>
+            <w:vAlign w:val="center"/>
+          </w:tcPr>
+          <w:p>
+            <w:r/>
+            <w:r>
+              <w:rPr>
+                <w:b w:val="0"/>
+                <w:sz w:val="18"/>
+              </w:rPr>
+              <w:t>Commit</w:t>
+            </w:r>
+          </w:p>
+        </w:tc>
+        <w:tc>
+          <w:tcPr>
+            <w:tcW w:type="dxa" w:w="4968"/>
+            <w:vAlign w:val="center"/>
+          </w:tcPr>
+          <w:p>
+            <w:r/>
+            <w:r>
+              <w:rPr>
+                <w:b w:val="0"/>
+                <w:sz w:val="18"/>
+              </w:rPr>
+              <w:t>6c53263 - fix: aplicar configuracion mysql en docker</w:t>
+            </w:r>
+          </w:p>
+        </w:tc>
+      </w:tr>
+      <w:tr>
+        <w:tc>
+          <w:tcPr>
+            <w:tcW w:type="dxa" w:w="4968"/>
+            <w:vAlign w:val="center"/>
+          </w:tcPr>
+          <w:p>
+            <w:r/>
+            <w:r>
+              <w:rPr>
+                <w:b w:val="0"/>
+                <w:sz w:val="18"/>
+              </w:rPr>
+              <w:t>Resultado</w:t>
+            </w:r>
+          </w:p>
+        </w:tc>
+        <w:tc>
+          <w:tcPr>
+            <w:tcW w:type="dxa" w:w="4968"/>
+            <w:vAlign w:val="center"/>
+          </w:tcPr>
+          <w:p>
+            <w:r/>
+            <w:r>
+              <w:rPr>
+                <w:b w:val="0"/>
+                <w:sz w:val="18"/>
+              </w:rPr>
+              <w:t>Laravel responde /login con HTTP 200 y la configuracion efectiva usa mysql/hospital_his.</w:t>
+            </w:r>
+          </w:p>
+        </w:tc>
+      </w:tr>
+    </w:tbl>
+    <w:p/>
+    <w:p>
+      <w:pPr>
+        <w:pStyle w:val="Heading2"/>
+      </w:pPr>
+      <w:r>
+        <w:t>Comandos de verificacion adicionales</w:t>
+      </w:r>
+    </w:p>
+    <w:p>
+      <w:pPr>
+        <w:jc w:val="left"/>
+      </w:pPr>
+      <w:r>
+        <w:rPr>
+          <w:rFonts w:ascii="Courier New" w:hAnsi="Courier New" w:eastAsia="Courier New"/>
+          <w:sz w:val="16"/>
+        </w:rPr>
+        <w:t>docker compose up -d --build app</w:t>
+        <w:br/>
+      </w:r>
+      <w:r>
+        <w:rPr>
+          <w:rFonts w:ascii="Courier New" w:hAnsi="Courier New" w:eastAsia="Courier New"/>
+          <w:sz w:val="16"/>
+        </w:rPr>
+        <w:t>docker compose exec -T app php artisan tinker --execute="dump(config('database.default')); dump(config('database.connections.mysql.host')); dump(config('database.connections.mysql.database'));"</w:t>
+        <w:br/>
+      </w:r>
+      <w:r>
+        <w:rPr>
+          <w:rFonts w:ascii="Courier New" w:hAnsi="Courier New" w:eastAsia="Courier New"/>
+          <w:sz w:val="16"/>
+        </w:rPr>
+        <w:t>curl -I http://localhost:8000/login</w:t>
+        <w:br/>
+      </w:r>
+      <w:r>
+        <w:rPr>
+          <w:rFonts w:ascii="Courier New" w:hAnsi="Courier New" w:eastAsia="Courier New"/>
+          <w:sz w:val="16"/>
+        </w:rPr>
+        <w:t>docker compose exec -T app php artisan test</w:t>
+        <w:br/>
+      </w:r>
+    </w:p>
     <w:sectPr>
       <w:pgSz w:w="12240" w:h="15840"/>
       <w:pgMar w:top="1080" w:right="1152" w:bottom="1080" w:left="1152" w:header="720" w:footer="720" w:gutter="0"/>

</xml_diff>